<commit_message>
Fix Unit 2 assignment: real clickable hyperlinks in references, correct Chandrakar & Bahadure (2024) publication year
</commit_message>
<xml_diff>
--- a/Term_02/CS 1101-01 Programming Fundamentals - AY2027-T1/Assignments/Unit 2 Assignment - Rafi.docx
+++ b/Term_02/CS 1101-01 Programming Fundamentals - AY2027-T1/Assignments/Unit 2 Assignment - Rafi.docx
@@ -247,7 +247,7 @@
           <w:i w:val="0"/>
           <w:sz w:val="24"/>
         </w:rPr>
-        <w:t xml:space="preserve"> (Chandrakar &amp; Bahadure, 2023). Python decides which block to run by testing each condition from top to bottom and stopping at the first one that's </w:t>
+        <w:t xml:space="preserve"> (Chandrakar &amp; Bahadure, 2024). Python decides which block to run by testing each condition from top to bottom and stopping at the first one that's </w:t>
       </w:r>
       <w:r>
         <w:rPr>
@@ -301,7 +301,7 @@
           <w:i w:val="0"/>
           <w:sz w:val="24"/>
         </w:rPr>
-        <w:t xml:space="preserve"> block runs (Chandrakar &amp; Bahadure, 2023). Only one block in the whole chain ever runs, no matter how many </w:t>
+        <w:t xml:space="preserve"> block runs (Chandrakar &amp; Bahadure, 2024). Only one block in the whole chain ever runs, no matter how many </w:t>
       </w:r>
       <w:r>
         <w:rPr>
@@ -1415,7 +1415,7 @@
           <w:i w:val="0"/>
           <w:sz w:val="24"/>
         </w:rPr>
-        <w:t xml:space="preserve"> block, so the inner check only runs once the outer branch has already been chosen (Chandrakar &amp; Bahadure, 2023). That's how the membership logic works: the program first checks whether someone picked "basic" or "premium," and only inside whichever branch gets chosen does it ask the follow-up question or print the follow-up message. Someone who picks "premium" never sees the personal-training question at all, because that question only exists inside the "basic" branch.</w:t>
+        <w:t xml:space="preserve"> block, so the inner check only runs once the outer branch has already been chosen (Chandrakar &amp; Bahadure, 2024). That's how the membership logic works: the program first checks whether someone picked "basic" or "premium," and only inside whichever branch gets chosen does it ask the follow-up question or print the follow-up message. Someone who picks "premium" never sees the personal-training question at all, because that question only exists inside the "basic" branch.</w:t>
       </w:r>
     </w:p>
     <w:p>
@@ -2169,10 +2169,9 @@
       <w:r>
         <w:rPr>
           <w:rFonts w:ascii="Times New Roman" w:hAnsi="Times New Roman"/>
-          <w:i w:val="0"/>
           <w:sz w:val="24"/>
         </w:rPr>
-        <w:t xml:space="preserve">Chandrakar, S., &amp; Bahadure, N. B. (2023). Concept of flow control statements in Python. In </w:t>
+        <w:t xml:space="preserve">Chandrakar, S., &amp; Bahadure, N. B. (2024). Concept of flow control statements in Python. In </w:t>
       </w:r>
       <w:r>
         <w:rPr>
@@ -2185,11 +2184,21 @@
       <w:r>
         <w:rPr>
           <w:rFonts w:ascii="Times New Roman" w:hAnsi="Times New Roman"/>
-          <w:i w:val="0"/>
           <w:sz w:val="24"/>
         </w:rPr>
-        <w:t xml:space="preserve"> (English ed.). BPB Publications.</w:t>
+        <w:t xml:space="preserve"> (English ed.). BPB Publications. </w:t>
       </w:r>
+      <w:hyperlink r:id="rId9">
+        <w:r>
+          <w:rPr>
+            <w:rFonts w:ascii="Times New Roman" w:hAnsi="Times New Roman"/>
+            <w:sz w:val="24"/>
+            <w:color w:val="0563C1"/>
+            <w:u w:val="single"/>
+          </w:rPr>
+          <w:t>https://ebookcentral.proquest.com/lib/univ-people-ebooks/detail.action?docID=30593726</w:t>
+        </w:r>
+      </w:hyperlink>
     </w:p>
     <w:p>
       <w:pPr>
@@ -2199,7 +2208,6 @@
       <w:r>
         <w:rPr>
           <w:rFonts w:ascii="Times New Roman" w:hAnsi="Times New Roman"/>
-          <w:i w:val="0"/>
           <w:sz w:val="24"/>
         </w:rPr>
         <w:t xml:space="preserve">Mohbey, K. K., &amp; Acharya, M. (2023). Data types, operators, and expressions. In </w:t>
@@ -2215,11 +2223,21 @@
       <w:r>
         <w:rPr>
           <w:rFonts w:ascii="Times New Roman" w:hAnsi="Times New Roman"/>
-          <w:i w:val="0"/>
           <w:sz w:val="24"/>
         </w:rPr>
-        <w:t>. Bentham Science Publishers.</w:t>
+        <w:t xml:space="preserve">. Bentham Science Publishers. </w:t>
       </w:r>
+      <w:hyperlink r:id="rId10">
+        <w:r>
+          <w:rPr>
+            <w:rFonts w:ascii="Times New Roman" w:hAnsi="Times New Roman"/>
+            <w:sz w:val="24"/>
+            <w:color w:val="0563C1"/>
+            <w:u w:val="single"/>
+          </w:rPr>
+          <w:t>https://doi.org/10.2174/9789815179637123010</w:t>
+        </w:r>
+      </w:hyperlink>
     </w:p>
     <w:sectPr>
       <w:pgSz w:w="12240" w:h="15840"/>

</xml_diff>

<commit_message>
Remove reference hyperlinks: both sources accessed via LIRN, no public URL applicable
</commit_message>
<xml_diff>
--- a/Term_02/CS 1101-01 Programming Fundamentals - AY2027-T1/Assignments/Unit 2 Assignment - Rafi.docx
+++ b/Term_02/CS 1101-01 Programming Fundamentals - AY2027-T1/Assignments/Unit 2 Assignment - Rafi.docx
@@ -2186,19 +2186,8 @@
           <w:rFonts w:ascii="Times New Roman" w:hAnsi="Times New Roman"/>
           <w:sz w:val="24"/>
         </w:rPr>
-        <w:t xml:space="preserve"> (English ed.). BPB Publications. </w:t>
+        <w:t xml:space="preserve"> (English ed.). BPB Publications.</w:t>
       </w:r>
-      <w:hyperlink r:id="rId9">
-        <w:r>
-          <w:rPr>
-            <w:rFonts w:ascii="Times New Roman" w:hAnsi="Times New Roman"/>
-            <w:sz w:val="24"/>
-            <w:color w:val="0563C1"/>
-            <w:u w:val="single"/>
-          </w:rPr>
-          <w:t>https://ebookcentral.proquest.com/lib/univ-people-ebooks/detail.action?docID=30593726</w:t>
-        </w:r>
-      </w:hyperlink>
     </w:p>
     <w:p>
       <w:pPr>
@@ -2225,19 +2214,8 @@
           <w:rFonts w:ascii="Times New Roman" w:hAnsi="Times New Roman"/>
           <w:sz w:val="24"/>
         </w:rPr>
-        <w:t xml:space="preserve">. Bentham Science Publishers. </w:t>
+        <w:t>. Bentham Science Publishers.</w:t>
       </w:r>
-      <w:hyperlink r:id="rId10">
-        <w:r>
-          <w:rPr>
-            <w:rFonts w:ascii="Times New Roman" w:hAnsi="Times New Roman"/>
-            <w:sz w:val="24"/>
-            <w:color w:val="0563C1"/>
-            <w:u w:val="single"/>
-          </w:rPr>
-          <w:t>https://doi.org/10.2174/9789815179637123010</w:t>
-        </w:r>
-      </w:hyperlink>
     </w:p>
     <w:sectPr>
       <w:pgSz w:w="12240" w:h="15840"/>

</xml_diff>